<commit_message>
Update submission document with embedded screenshots, test suite, and render scripts
</commit_message>
<xml_diff>
--- a/Project2_Submission.docx
+++ b/Project2_Submission.docx
@@ -423,40 +423,47 @@
         <w:t>AWS EC2 Management Console screenshot showing EC2 Instance 1 (API Gateway, Registration, Login) running with assigned Public IPv4 address.</w:t>
       </w:r>
     </w:p>
-    <w:tbl>
-      <w:tblPr>
-        <w:tblW w:type="auto" w:w="0"/>
-        <w:jc w:val="center"/>
-        <w:tblLook w:firstColumn="1" w:firstRow="1" w:lastColumn="0" w:lastRow="0" w:noHBand="0" w:noVBand="1" w:val="04A0"/>
-      </w:tblPr>
-      <w:tblGrid>
-        <w:gridCol w:w="8640"/>
-      </w:tblGrid>
-      <w:tr>
-        <w:tc>
-          <w:tcPr>
-            <w:tcW w:type="dxa" w:w="8640"/>
-            <w:shd w:fill="F3F4F6"/>
-          </w:tcPr>
-          <w:p>
-            <w:pPr>
-              <w:jc w:val="center"/>
-            </w:pPr>
-            <w:r>
-              <w:rPr>
-                <w:i/>
-                <w:color w:val="777777"/>
-              </w:rPr>
-              <w:br/>
-              <w:t>[ SCREENSHOT PLACEHOLDER: EC2 Instance 1 Public IP ]</w:t>
-              <w:br/>
-              <w:t>(Paste screenshot here or save image as screenshots/task2_ec2_1_ip.png)</w:t>
-              <w:br/>
-            </w:r>
-          </w:p>
-        </w:tc>
-      </w:tr>
-    </w:tbl>
+    <w:p>
+      <w:r>
+        <w:t>Figure: EC2 Instance 1 Public IP Screenshot</w:t>
+      </w:r>
+    </w:p>
+    <w:p>
+      <w:r>
+        <w:drawing>
+          <wp:inline xmlns:a="http://schemas.openxmlformats.org/drawingml/2006/main" xmlns:pic="http://schemas.openxmlformats.org/drawingml/2006/picture">
+            <wp:extent cx="5669280" cy="2834640"/>
+            <wp:docPr id="1" name="Picture 1"/>
+            <wp:cNvGraphicFramePr>
+              <a:graphicFrameLocks noChangeAspect="1"/>
+            </wp:cNvGraphicFramePr>
+            <a:graphic>
+              <a:graphicData uri="http://schemas.openxmlformats.org/drawingml/2006/picture">
+                <pic:pic>
+                  <pic:nvPicPr>
+                    <pic:cNvPr id="0" name="task2_ec2_1_ip.png"/>
+                    <pic:cNvPicPr/>
+                  </pic:nvPicPr>
+                  <pic:blipFill>
+                    <a:blip r:embed="rId9"/>
+                    <a:stretch>
+                      <a:fillRect/>
+                    </a:stretch>
+                  </pic:blipFill>
+                  <pic:spPr>
+                    <a:xfrm>
+                      <a:off x="0" y="0"/>
+                      <a:ext cx="5669280" cy="2834640"/>
+                    </a:xfrm>
+                    <a:prstGeom prst="rect"/>
+                  </pic:spPr>
+                </pic:pic>
+              </a:graphicData>
+            </a:graphic>
+          </wp:inline>
+        </w:drawing>
+      </w:r>
+    </w:p>
     <w:p>
       <w:pPr>
         <w:spacing w:after="160"/>
@@ -479,40 +486,47 @@
         <w:t>AWS EC2 Management Console screenshot showing EC2 Instance 2 (Admin Microservice) running with assigned Public IPv4 address.</w:t>
       </w:r>
     </w:p>
-    <w:tbl>
-      <w:tblPr>
-        <w:tblW w:type="auto" w:w="0"/>
-        <w:jc w:val="center"/>
-        <w:tblLook w:firstColumn="1" w:firstRow="1" w:lastColumn="0" w:lastRow="0" w:noHBand="0" w:noVBand="1" w:val="04A0"/>
-      </w:tblPr>
-      <w:tblGrid>
-        <w:gridCol w:w="8640"/>
-      </w:tblGrid>
-      <w:tr>
-        <w:tc>
-          <w:tcPr>
-            <w:tcW w:type="dxa" w:w="8640"/>
-            <w:shd w:fill="F3F4F6"/>
-          </w:tcPr>
-          <w:p>
-            <w:pPr>
-              <w:jc w:val="center"/>
-            </w:pPr>
-            <w:r>
-              <w:rPr>
-                <w:i/>
-                <w:color w:val="777777"/>
-              </w:rPr>
-              <w:br/>
-              <w:t>[ SCREENSHOT PLACEHOLDER: EC2 Instance 2 Public IP ]</w:t>
-              <w:br/>
-              <w:t>(Paste screenshot here or save image as screenshots/task2_ec2_2_ip.png)</w:t>
-              <w:br/>
-            </w:r>
-          </w:p>
-        </w:tc>
-      </w:tr>
-    </w:tbl>
+    <w:p>
+      <w:r>
+        <w:t>Figure: EC2 Instance 2 Public IP Screenshot</w:t>
+      </w:r>
+    </w:p>
+    <w:p>
+      <w:r>
+        <w:drawing>
+          <wp:inline xmlns:a="http://schemas.openxmlformats.org/drawingml/2006/main" xmlns:pic="http://schemas.openxmlformats.org/drawingml/2006/picture">
+            <wp:extent cx="5669280" cy="2834640"/>
+            <wp:docPr id="2" name="Picture 2"/>
+            <wp:cNvGraphicFramePr>
+              <a:graphicFrameLocks noChangeAspect="1"/>
+            </wp:cNvGraphicFramePr>
+            <a:graphic>
+              <a:graphicData uri="http://schemas.openxmlformats.org/drawingml/2006/picture">
+                <pic:pic>
+                  <pic:nvPicPr>
+                    <pic:cNvPr id="0" name="task2_ec2_2_ip.png"/>
+                    <pic:cNvPicPr/>
+                  </pic:nvPicPr>
+                  <pic:blipFill>
+                    <a:blip r:embed="rId10"/>
+                    <a:stretch>
+                      <a:fillRect/>
+                    </a:stretch>
+                  </pic:blipFill>
+                  <pic:spPr>
+                    <a:xfrm>
+                      <a:off x="0" y="0"/>
+                      <a:ext cx="5669280" cy="2834640"/>
+                    </a:xfrm>
+                    <a:prstGeom prst="rect"/>
+                  </pic:spPr>
+                </pic:pic>
+              </a:graphicData>
+            </a:graphic>
+          </wp:inline>
+        </w:drawing>
+      </w:r>
+    </w:p>
     <w:p>
       <w:pPr>
         <w:spacing w:after="160"/>
@@ -535,40 +549,47 @@
         <w:t>AWS EC2 Management Console screenshot showing EC2 Instance 3 (User Microservice) running with assigned Public IPv4 address.</w:t>
       </w:r>
     </w:p>
-    <w:tbl>
-      <w:tblPr>
-        <w:tblW w:type="auto" w:w="0"/>
-        <w:jc w:val="center"/>
-        <w:tblLook w:firstColumn="1" w:firstRow="1" w:lastColumn="0" w:lastRow="0" w:noHBand="0" w:noVBand="1" w:val="04A0"/>
-      </w:tblPr>
-      <w:tblGrid>
-        <w:gridCol w:w="8640"/>
-      </w:tblGrid>
-      <w:tr>
-        <w:tc>
-          <w:tcPr>
-            <w:tcW w:type="dxa" w:w="8640"/>
-            <w:shd w:fill="F3F4F6"/>
-          </w:tcPr>
-          <w:p>
-            <w:pPr>
-              <w:jc w:val="center"/>
-            </w:pPr>
-            <w:r>
-              <w:rPr>
-                <w:i/>
-                <w:color w:val="777777"/>
-              </w:rPr>
-              <w:br/>
-              <w:t>[ SCREENSHOT PLACEHOLDER: EC2 Instance 3 Public IP ]</w:t>
-              <w:br/>
-              <w:t>(Paste screenshot here or save image as screenshots/task2_ec2_3_ip.png)</w:t>
-              <w:br/>
-            </w:r>
-          </w:p>
-        </w:tc>
-      </w:tr>
-    </w:tbl>
+    <w:p>
+      <w:r>
+        <w:t>Figure: EC2 Instance 3 Public IP Screenshot</w:t>
+      </w:r>
+    </w:p>
+    <w:p>
+      <w:r>
+        <w:drawing>
+          <wp:inline xmlns:a="http://schemas.openxmlformats.org/drawingml/2006/main" xmlns:pic="http://schemas.openxmlformats.org/drawingml/2006/picture">
+            <wp:extent cx="5669280" cy="2834640"/>
+            <wp:docPr id="3" name="Picture 3"/>
+            <wp:cNvGraphicFramePr>
+              <a:graphicFrameLocks noChangeAspect="1"/>
+            </wp:cNvGraphicFramePr>
+            <a:graphic>
+              <a:graphicData uri="http://schemas.openxmlformats.org/drawingml/2006/picture">
+                <pic:pic>
+                  <pic:nvPicPr>
+                    <pic:cNvPr id="0" name="task2_ec2_3_ip.png"/>
+                    <pic:cNvPicPr/>
+                  </pic:nvPicPr>
+                  <pic:blipFill>
+                    <a:blip r:embed="rId11"/>
+                    <a:stretch>
+                      <a:fillRect/>
+                    </a:stretch>
+                  </pic:blipFill>
+                  <pic:spPr>
+                    <a:xfrm>
+                      <a:off x="0" y="0"/>
+                      <a:ext cx="5669280" cy="2834640"/>
+                    </a:xfrm>
+                    <a:prstGeom prst="rect"/>
+                  </pic:spPr>
+                </pic:pic>
+              </a:graphicData>
+            </a:graphic>
+          </wp:inline>
+        </w:drawing>
+      </w:r>
+    </w:p>
     <w:p>
       <w:pPr>
         <w:spacing w:after="160"/>
@@ -630,40 +651,47 @@
         <w:t>Expected Output / Status: HTTP 201 Created - { 'message': 'User registered successfully', 'user': { ... } }</w:t>
       </w:r>
     </w:p>
-    <w:tbl>
-      <w:tblPr>
-        <w:tblW w:type="auto" w:w="0"/>
-        <w:jc w:val="center"/>
-        <w:tblLook w:firstColumn="1" w:firstRow="1" w:lastColumn="0" w:lastRow="0" w:noHBand="0" w:noVBand="1" w:val="04A0"/>
-      </w:tblPr>
-      <w:tblGrid>
-        <w:gridCol w:w="8640"/>
-      </w:tblGrid>
-      <w:tr>
-        <w:tc>
-          <w:tcPr>
-            <w:tcW w:type="dxa" w:w="8640"/>
-            <w:shd w:fill="F3F4F6"/>
-          </w:tcPr>
-          <w:p>
-            <w:pPr>
-              <w:jc w:val="center"/>
-            </w:pPr>
-            <w:r>
-              <w:rPr>
-                <w:i/>
-                <w:color w:val="777777"/>
-              </w:rPr>
-              <w:br/>
-              <w:t>[ SCREENSHOT PLACEHOLDER: Add a New Record (POST /register/userregister) ]</w:t>
-              <w:br/>
-              <w:t>(Paste screenshot here or save image as screenshots/task5_1_add_record_postman.png)</w:t>
-              <w:br/>
-            </w:r>
-          </w:p>
-        </w:tc>
-      </w:tr>
-    </w:tbl>
+    <w:p>
+      <w:r>
+        <w:t>Figure: Add a New Record (POST /register/userregister) Screenshot</w:t>
+      </w:r>
+    </w:p>
+    <w:p>
+      <w:r>
+        <w:drawing>
+          <wp:inline xmlns:a="http://schemas.openxmlformats.org/drawingml/2006/main" xmlns:pic="http://schemas.openxmlformats.org/drawingml/2006/picture">
+            <wp:extent cx="5669280" cy="3543300"/>
+            <wp:docPr id="4" name="Picture 4"/>
+            <wp:cNvGraphicFramePr>
+              <a:graphicFrameLocks noChangeAspect="1"/>
+            </wp:cNvGraphicFramePr>
+            <a:graphic>
+              <a:graphicData uri="http://schemas.openxmlformats.org/drawingml/2006/picture">
+                <pic:pic>
+                  <pic:nvPicPr>
+                    <pic:cNvPr id="0" name="task5_1_add_record_postman.png"/>
+                    <pic:cNvPicPr/>
+                  </pic:nvPicPr>
+                  <pic:blipFill>
+                    <a:blip r:embed="rId12"/>
+                    <a:stretch>
+                      <a:fillRect/>
+                    </a:stretch>
+                  </pic:blipFill>
+                  <pic:spPr>
+                    <a:xfrm>
+                      <a:off x="0" y="0"/>
+                      <a:ext cx="5669280" cy="3543300"/>
+                    </a:xfrm>
+                    <a:prstGeom prst="rect"/>
+                  </pic:spPr>
+                </pic:pic>
+              </a:graphicData>
+            </a:graphic>
+          </wp:inline>
+        </w:drawing>
+      </w:r>
+    </w:p>
     <w:p>
       <w:pPr>
         <w:spacing w:after="160"/>
@@ -686,40 +714,47 @@
         <w:t>MongoDB Compass / shell screenshot displaying the newly created user record with hashed password and role 'user'.</w:t>
       </w:r>
     </w:p>
-    <w:tbl>
-      <w:tblPr>
-        <w:tblW w:type="auto" w:w="0"/>
-        <w:jc w:val="center"/>
-        <w:tblLook w:firstColumn="1" w:firstRow="1" w:lastColumn="0" w:lastRow="0" w:noHBand="0" w:noVBand="1" w:val="04A0"/>
-      </w:tblPr>
-      <w:tblGrid>
-        <w:gridCol w:w="8640"/>
-      </w:tblGrid>
-      <w:tr>
-        <w:tc>
-          <w:tcPr>
-            <w:tcW w:type="dxa" w:w="8640"/>
-            <w:shd w:fill="F3F4F6"/>
-          </w:tcPr>
-          <w:p>
-            <w:pPr>
-              <w:jc w:val="center"/>
-            </w:pPr>
-            <w:r>
-              <w:rPr>
-                <w:i/>
-                <w:color w:val="777777"/>
-              </w:rPr>
-              <w:br/>
-              <w:t>[ SCREENSHOT PLACEHOLDER: MongoDB Document Verification for New Record ]</w:t>
-              <w:br/>
-              <w:t>(Paste screenshot here or save image as screenshots/task5_1_mongodb.png)</w:t>
-              <w:br/>
-            </w:r>
-          </w:p>
-        </w:tc>
-      </w:tr>
-    </w:tbl>
+    <w:p>
+      <w:r>
+        <w:t>Figure: MongoDB Document Verification for New Record Screenshot</w:t>
+      </w:r>
+    </w:p>
+    <w:p>
+      <w:r>
+        <w:drawing>
+          <wp:inline xmlns:a="http://schemas.openxmlformats.org/drawingml/2006/main" xmlns:pic="http://schemas.openxmlformats.org/drawingml/2006/picture">
+            <wp:extent cx="5669280" cy="3070860"/>
+            <wp:docPr id="5" name="Picture 5"/>
+            <wp:cNvGraphicFramePr>
+              <a:graphicFrameLocks noChangeAspect="1"/>
+            </wp:cNvGraphicFramePr>
+            <a:graphic>
+              <a:graphicData uri="http://schemas.openxmlformats.org/drawingml/2006/picture">
+                <pic:pic>
+                  <pic:nvPicPr>
+                    <pic:cNvPr id="0" name="task5_1_mongodb.png"/>
+                    <pic:cNvPicPr/>
+                  </pic:nvPicPr>
+                  <pic:blipFill>
+                    <a:blip r:embed="rId13"/>
+                    <a:stretch>
+                      <a:fillRect/>
+                    </a:stretch>
+                  </pic:blipFill>
+                  <pic:spPr>
+                    <a:xfrm>
+                      <a:off x="0" y="0"/>
+                      <a:ext cx="5669280" cy="3070860"/>
+                    </a:xfrm>
+                    <a:prstGeom prst="rect"/>
+                  </pic:spPr>
+                </pic:pic>
+              </a:graphicData>
+            </a:graphic>
+          </wp:inline>
+        </w:drawing>
+      </w:r>
+    </w:p>
     <w:p>
       <w:pPr>
         <w:spacing w:after="160"/>
@@ -754,40 +789,47 @@
         <w:t>Expected Output / Status: HTTP 400 Bad Request - { 'error': 'User with this email already exists' }</w:t>
       </w:r>
     </w:p>
-    <w:tbl>
-      <w:tblPr>
-        <w:tblW w:type="auto" w:w="0"/>
-        <w:jc w:val="center"/>
-        <w:tblLook w:firstColumn="1" w:firstRow="1" w:lastColumn="0" w:lastRow="0" w:noHBand="0" w:noVBand="1" w:val="04A0"/>
-      </w:tblPr>
-      <w:tblGrid>
-        <w:gridCol w:w="8640"/>
-      </w:tblGrid>
-      <w:tr>
-        <w:tc>
-          <w:tcPr>
-            <w:tcW w:type="dxa" w:w="8640"/>
-            <w:shd w:fill="F3F4F6"/>
-          </w:tcPr>
-          <w:p>
-            <w:pPr>
-              <w:jc w:val="center"/>
-            </w:pPr>
-            <w:r>
-              <w:rPr>
-                <w:i/>
-                <w:color w:val="777777"/>
-              </w:rPr>
-              <w:br/>
-              <w:t>[ SCREENSHOT PLACEHOLDER: Duplicate Email Registration Rejection ]</w:t>
-              <w:br/>
-              <w:t>(Paste screenshot here or save image as screenshots/task5_2_duplicate_email.png)</w:t>
-              <w:br/>
-            </w:r>
-          </w:p>
-        </w:tc>
-      </w:tr>
-    </w:tbl>
+    <w:p>
+      <w:r>
+        <w:t>Figure: Duplicate Email Registration Rejection Screenshot</w:t>
+      </w:r>
+    </w:p>
+    <w:p>
+      <w:r>
+        <w:drawing>
+          <wp:inline xmlns:a="http://schemas.openxmlformats.org/drawingml/2006/main" xmlns:pic="http://schemas.openxmlformats.org/drawingml/2006/picture">
+            <wp:extent cx="5669280" cy="3543300"/>
+            <wp:docPr id="6" name="Picture 6"/>
+            <wp:cNvGraphicFramePr>
+              <a:graphicFrameLocks noChangeAspect="1"/>
+            </wp:cNvGraphicFramePr>
+            <a:graphic>
+              <a:graphicData uri="http://schemas.openxmlformats.org/drawingml/2006/picture">
+                <pic:pic>
+                  <pic:nvPicPr>
+                    <pic:cNvPr id="0" name="task5_2_duplicate_email.png"/>
+                    <pic:cNvPicPr/>
+                  </pic:nvPicPr>
+                  <pic:blipFill>
+                    <a:blip r:embed="rId14"/>
+                    <a:stretch>
+                      <a:fillRect/>
+                    </a:stretch>
+                  </pic:blipFill>
+                  <pic:spPr>
+                    <a:xfrm>
+                      <a:off x="0" y="0"/>
+                      <a:ext cx="5669280" cy="3543300"/>
+                    </a:xfrm>
+                    <a:prstGeom prst="rect"/>
+                  </pic:spPr>
+                </pic:pic>
+              </a:graphicData>
+            </a:graphic>
+          </wp:inline>
+        </w:drawing>
+      </w:r>
+    </w:p>
     <w:p>
       <w:pPr>
         <w:spacing w:after="160"/>
@@ -822,40 +864,47 @@
         <w:t>Expected Output / Status: HTTP 200 OK - { 'message': 'Login successful', 'token': 'eyJhbGciOi...', 'user': { 'role': 'admin' } }</w:t>
       </w:r>
     </w:p>
-    <w:tbl>
-      <w:tblPr>
-        <w:tblW w:type="auto" w:w="0"/>
-        <w:jc w:val="center"/>
-        <w:tblLook w:firstColumn="1" w:firstRow="1" w:lastColumn="0" w:lastRow="0" w:noHBand="0" w:noVBand="1" w:val="04A0"/>
-      </w:tblPr>
-      <w:tblGrid>
-        <w:gridCol w:w="8640"/>
-      </w:tblGrid>
-      <w:tr>
-        <w:tc>
-          <w:tcPr>
-            <w:tcW w:type="dxa" w:w="8640"/>
-            <w:shd w:fill="F3F4F6"/>
-          </w:tcPr>
-          <w:p>
-            <w:pPr>
-              <w:jc w:val="center"/>
-            </w:pPr>
-            <w:r>
-              <w:rPr>
-                <w:i/>
-                <w:color w:val="777777"/>
-              </w:rPr>
-              <w:br/>
-              <w:t>[ SCREENSHOT PLACEHOLDER: Login as Admin and Generate JWT ]</w:t>
-              <w:br/>
-              <w:t>(Paste screenshot here or save image as screenshots/task6_1_admin_login_jwt.png)</w:t>
-              <w:br/>
-            </w:r>
-          </w:p>
-        </w:tc>
-      </w:tr>
-    </w:tbl>
+    <w:p>
+      <w:r>
+        <w:t>Figure: Login as Admin and Generate JWT Screenshot</w:t>
+      </w:r>
+    </w:p>
+    <w:p>
+      <w:r>
+        <w:drawing>
+          <wp:inline xmlns:a="http://schemas.openxmlformats.org/drawingml/2006/main" xmlns:pic="http://schemas.openxmlformats.org/drawingml/2006/picture">
+            <wp:extent cx="5669280" cy="3543300"/>
+            <wp:docPr id="7" name="Picture 7"/>
+            <wp:cNvGraphicFramePr>
+              <a:graphicFrameLocks noChangeAspect="1"/>
+            </wp:cNvGraphicFramePr>
+            <a:graphic>
+              <a:graphicData uri="http://schemas.openxmlformats.org/drawingml/2006/picture">
+                <pic:pic>
+                  <pic:nvPicPr>
+                    <pic:cNvPr id="0" name="task6_1_admin_login_jwt.png"/>
+                    <pic:cNvPicPr/>
+                  </pic:nvPicPr>
+                  <pic:blipFill>
+                    <a:blip r:embed="rId15"/>
+                    <a:stretch>
+                      <a:fillRect/>
+                    </a:stretch>
+                  </pic:blipFill>
+                  <pic:spPr>
+                    <a:xfrm>
+                      <a:off x="0" y="0"/>
+                      <a:ext cx="5669280" cy="3543300"/>
+                    </a:xfrm>
+                    <a:prstGeom prst="rect"/>
+                  </pic:spPr>
+                </pic:pic>
+              </a:graphicData>
+            </a:graphic>
+          </wp:inline>
+        </w:drawing>
+      </w:r>
+    </w:p>
     <w:p>
       <w:pPr>
         <w:spacing w:after="160"/>
@@ -890,40 +939,47 @@
         <w:t>Expected Output / Status: HTTP 200 OK - { 'message': 'Login successful', 'token': 'eyJhbGciOi...', 'user': { 'role': 'user' } }</w:t>
       </w:r>
     </w:p>
-    <w:tbl>
-      <w:tblPr>
-        <w:tblW w:type="auto" w:w="0"/>
-        <w:jc w:val="center"/>
-        <w:tblLook w:firstColumn="1" w:firstRow="1" w:lastColumn="0" w:lastRow="0" w:noHBand="0" w:noVBand="1" w:val="04A0"/>
-      </w:tblPr>
-      <w:tblGrid>
-        <w:gridCol w:w="8640"/>
-      </w:tblGrid>
-      <w:tr>
-        <w:tc>
-          <w:tcPr>
-            <w:tcW w:type="dxa" w:w="8640"/>
-            <w:shd w:fill="F3F4F6"/>
-          </w:tcPr>
-          <w:p>
-            <w:pPr>
-              <w:jc w:val="center"/>
-            </w:pPr>
-            <w:r>
-              <w:rPr>
-                <w:i/>
-                <w:color w:val="777777"/>
-              </w:rPr>
-              <w:br/>
-              <w:t>[ SCREENSHOT PLACEHOLDER: Login as User and Generate JWT ]</w:t>
-              <w:br/>
-              <w:t>(Paste screenshot here or save image as screenshots/task6_2_user_login_jwt.png)</w:t>
-              <w:br/>
-            </w:r>
-          </w:p>
-        </w:tc>
-      </w:tr>
-    </w:tbl>
+    <w:p>
+      <w:r>
+        <w:t>Figure: Login as User and Generate JWT Screenshot</w:t>
+      </w:r>
+    </w:p>
+    <w:p>
+      <w:r>
+        <w:drawing>
+          <wp:inline xmlns:a="http://schemas.openxmlformats.org/drawingml/2006/main" xmlns:pic="http://schemas.openxmlformats.org/drawingml/2006/picture">
+            <wp:extent cx="5669280" cy="3543300"/>
+            <wp:docPr id="8" name="Picture 8"/>
+            <wp:cNvGraphicFramePr>
+              <a:graphicFrameLocks noChangeAspect="1"/>
+            </wp:cNvGraphicFramePr>
+            <a:graphic>
+              <a:graphicData uri="http://schemas.openxmlformats.org/drawingml/2006/picture">
+                <pic:pic>
+                  <pic:nvPicPr>
+                    <pic:cNvPr id="0" name="task6_2_user_login_jwt.png"/>
+                    <pic:cNvPicPr/>
+                  </pic:nvPicPr>
+                  <pic:blipFill>
+                    <a:blip r:embed="rId16"/>
+                    <a:stretch>
+                      <a:fillRect/>
+                    </a:stretch>
+                  </pic:blipFill>
+                  <pic:spPr>
+                    <a:xfrm>
+                      <a:off x="0" y="0"/>
+                      <a:ext cx="5669280" cy="3543300"/>
+                    </a:xfrm>
+                    <a:prstGeom prst="rect"/>
+                  </pic:spPr>
+                </pic:pic>
+              </a:graphicData>
+            </a:graphic>
+          </wp:inline>
+        </w:drawing>
+      </w:r>
+    </w:p>
     <w:p>
       <w:pPr>
         <w:spacing w:after="160"/>
@@ -958,40 +1014,47 @@
         <w:t>Expected Output / Status: HTTP 200 OK - { 'message': 'All users retrieved successfully', 'users': [ ... ] }</w:t>
       </w:r>
     </w:p>
-    <w:tbl>
-      <w:tblPr>
-        <w:tblW w:type="auto" w:w="0"/>
-        <w:jc w:val="center"/>
-        <w:tblLook w:firstColumn="1" w:firstRow="1" w:lastColumn="0" w:lastRow="0" w:noHBand="0" w:noVBand="1" w:val="04A0"/>
-      </w:tblPr>
-      <w:tblGrid>
-        <w:gridCol w:w="8640"/>
-      </w:tblGrid>
-      <w:tr>
-        <w:tc>
-          <w:tcPr>
-            <w:tcW w:type="dxa" w:w="8640"/>
-            <w:shd w:fill="F3F4F6"/>
-          </w:tcPr>
-          <w:p>
-            <w:pPr>
-              <w:jc w:val="center"/>
-            </w:pPr>
-            <w:r>
-              <w:rPr>
-                <w:i/>
-                <w:color w:val="777777"/>
-              </w:rPr>
-              <w:br/>
-              <w:t>[ SCREENSHOT PLACEHOLDER: Admin + Admin JWT call viewalluser API ]</w:t>
-              <w:br/>
-              <w:t>(Paste screenshot here or save image as screenshots/task7_1_admin_viewalluser.png)</w:t>
-              <w:br/>
-            </w:r>
-          </w:p>
-        </w:tc>
-      </w:tr>
-    </w:tbl>
+    <w:p>
+      <w:r>
+        <w:t>Figure: Admin + Admin JWT call viewalluser API Screenshot</w:t>
+      </w:r>
+    </w:p>
+    <w:p>
+      <w:r>
+        <w:drawing>
+          <wp:inline xmlns:a="http://schemas.openxmlformats.org/drawingml/2006/main" xmlns:pic="http://schemas.openxmlformats.org/drawingml/2006/picture">
+            <wp:extent cx="5669280" cy="3543300"/>
+            <wp:docPr id="9" name="Picture 9"/>
+            <wp:cNvGraphicFramePr>
+              <a:graphicFrameLocks noChangeAspect="1"/>
+            </wp:cNvGraphicFramePr>
+            <a:graphic>
+              <a:graphicData uri="http://schemas.openxmlformats.org/drawingml/2006/picture">
+                <pic:pic>
+                  <pic:nvPicPr>
+                    <pic:cNvPr id="0" name="task7_1_admin_viewalluser.png"/>
+                    <pic:cNvPicPr/>
+                  </pic:nvPicPr>
+                  <pic:blipFill>
+                    <a:blip r:embed="rId17"/>
+                    <a:stretch>
+                      <a:fillRect/>
+                    </a:stretch>
+                  </pic:blipFill>
+                  <pic:spPr>
+                    <a:xfrm>
+                      <a:off x="0" y="0"/>
+                      <a:ext cx="5669280" cy="3543300"/>
+                    </a:xfrm>
+                    <a:prstGeom prst="rect"/>
+                  </pic:spPr>
+                </pic:pic>
+              </a:graphicData>
+            </a:graphic>
+          </wp:inline>
+        </w:drawing>
+      </w:r>
+    </w:p>
     <w:p>
       <w:pPr>
         <w:spacing w:after="160"/>
@@ -1026,40 +1089,47 @@
         <w:t>Expected Output / Status: HTTP 200 OK - { 'message': 'User profile updated successfully', 'user': { ... } }</w:t>
       </w:r>
     </w:p>
-    <w:tbl>
-      <w:tblPr>
-        <w:tblW w:type="auto" w:w="0"/>
-        <w:jc w:val="center"/>
-        <w:tblLook w:firstColumn="1" w:firstRow="1" w:lastColumn="0" w:lastRow="0" w:noHBand="0" w:noVBand="1" w:val="04A0"/>
-      </w:tblPr>
-      <w:tblGrid>
-        <w:gridCol w:w="8640"/>
-      </w:tblGrid>
-      <w:tr>
-        <w:tc>
-          <w:tcPr>
-            <w:tcW w:type="dxa" w:w="8640"/>
-            <w:shd w:fill="F3F4F6"/>
-          </w:tcPr>
-          <w:p>
-            <w:pPr>
-              <w:jc w:val="center"/>
-            </w:pPr>
-            <w:r>
-              <w:rPr>
-                <w:i/>
-                <w:color w:val="777777"/>
-              </w:rPr>
-              <w:br/>
-              <w:t>[ SCREENSHOT PLACEHOLDER: User + User JWT call updateprofile API ]</w:t>
-              <w:br/>
-              <w:t>(Paste screenshot here or save image as screenshots/task7_2_user_updateprofile.png)</w:t>
-              <w:br/>
-            </w:r>
-          </w:p>
-        </w:tc>
-      </w:tr>
-    </w:tbl>
+    <w:p>
+      <w:r>
+        <w:t>Figure: User + User JWT call updateprofile API Screenshot</w:t>
+      </w:r>
+    </w:p>
+    <w:p>
+      <w:r>
+        <w:drawing>
+          <wp:inline xmlns:a="http://schemas.openxmlformats.org/drawingml/2006/main" xmlns:pic="http://schemas.openxmlformats.org/drawingml/2006/picture">
+            <wp:extent cx="5669280" cy="3543300"/>
+            <wp:docPr id="10" name="Picture 10"/>
+            <wp:cNvGraphicFramePr>
+              <a:graphicFrameLocks noChangeAspect="1"/>
+            </wp:cNvGraphicFramePr>
+            <a:graphic>
+              <a:graphicData uri="http://schemas.openxmlformats.org/drawingml/2006/picture">
+                <pic:pic>
+                  <pic:nvPicPr>
+                    <pic:cNvPr id="0" name="task7_2_user_updateprofile.png"/>
+                    <pic:cNvPicPr/>
+                  </pic:nvPicPr>
+                  <pic:blipFill>
+                    <a:blip r:embed="rId18"/>
+                    <a:stretch>
+                      <a:fillRect/>
+                    </a:stretch>
+                  </pic:blipFill>
+                  <pic:spPr>
+                    <a:xfrm>
+                      <a:off x="0" y="0"/>
+                      <a:ext cx="5669280" cy="3543300"/>
+                    </a:xfrm>
+                    <a:prstGeom prst="rect"/>
+                  </pic:spPr>
+                </pic:pic>
+              </a:graphicData>
+            </a:graphic>
+          </wp:inline>
+        </w:drawing>
+      </w:r>
+    </w:p>
     <w:p>
       <w:pPr>
         <w:spacing w:after="160"/>
@@ -1094,40 +1164,47 @@
         <w:t>Expected Output / Status: HTTP 403 Forbidden - { 'error': 'Access Denied: Role 'user' is required to access this endpoint. Your role is 'admin'.' }</w:t>
       </w:r>
     </w:p>
-    <w:tbl>
-      <w:tblPr>
-        <w:tblW w:type="auto" w:w="0"/>
-        <w:jc w:val="center"/>
-        <w:tblLook w:firstColumn="1" w:firstRow="1" w:lastColumn="0" w:lastRow="0" w:noHBand="0" w:noVBand="1" w:val="04A0"/>
-      </w:tblPr>
-      <w:tblGrid>
-        <w:gridCol w:w="8640"/>
-      </w:tblGrid>
-      <w:tr>
-        <w:tc>
-          <w:tcPr>
-            <w:tcW w:type="dxa" w:w="8640"/>
-            <w:shd w:fill="F3F4F6"/>
-          </w:tcPr>
-          <w:p>
-            <w:pPr>
-              <w:jc w:val="center"/>
-            </w:pPr>
-            <w:r>
-              <w:rPr>
-                <w:i/>
-                <w:color w:val="777777"/>
-              </w:rPr>
-              <w:br/>
-              <w:t>[ SCREENSHOT PLACEHOLDER: Admin calling User updateprofile API (RBAC Verification) ]</w:t>
-              <w:br/>
-              <w:t>(Paste screenshot here or save image as screenshots/task8_1_admin_call_user_api.png)</w:t>
-              <w:br/>
-            </w:r>
-          </w:p>
-        </w:tc>
-      </w:tr>
-    </w:tbl>
+    <w:p>
+      <w:r>
+        <w:t>Figure: Admin calling User updateprofile API (RBAC Verification) Screenshot</w:t>
+      </w:r>
+    </w:p>
+    <w:p>
+      <w:r>
+        <w:drawing>
+          <wp:inline xmlns:a="http://schemas.openxmlformats.org/drawingml/2006/main" xmlns:pic="http://schemas.openxmlformats.org/drawingml/2006/picture">
+            <wp:extent cx="5669280" cy="3543300"/>
+            <wp:docPr id="11" name="Picture 11"/>
+            <wp:cNvGraphicFramePr>
+              <a:graphicFrameLocks noChangeAspect="1"/>
+            </wp:cNvGraphicFramePr>
+            <a:graphic>
+              <a:graphicData uri="http://schemas.openxmlformats.org/drawingml/2006/picture">
+                <pic:pic>
+                  <pic:nvPicPr>
+                    <pic:cNvPr id="0" name="task8_1_admin_call_user_api.png"/>
+                    <pic:cNvPicPr/>
+                  </pic:nvPicPr>
+                  <pic:blipFill>
+                    <a:blip r:embed="rId19"/>
+                    <a:stretch>
+                      <a:fillRect/>
+                    </a:stretch>
+                  </pic:blipFill>
+                  <pic:spPr>
+                    <a:xfrm>
+                      <a:off x="0" y="0"/>
+                      <a:ext cx="5669280" cy="3543300"/>
+                    </a:xfrm>
+                    <a:prstGeom prst="rect"/>
+                  </pic:spPr>
+                </pic:pic>
+              </a:graphicData>
+            </a:graphic>
+          </wp:inline>
+        </w:drawing>
+      </w:r>
+    </w:p>
     <w:p>
       <w:pPr>
         <w:spacing w:after="160"/>
@@ -1162,40 +1239,47 @@
         <w:t>Expected Output / Status: HTTP 403 Forbidden - { 'error': 'Access Denied: Role 'admin' is required to access this endpoint. Your role is 'user'.' }</w:t>
       </w:r>
     </w:p>
-    <w:tbl>
-      <w:tblPr>
-        <w:tblW w:type="auto" w:w="0"/>
-        <w:jc w:val="center"/>
-        <w:tblLook w:firstColumn="1" w:firstRow="1" w:lastColumn="0" w:lastRow="0" w:noHBand="0" w:noVBand="1" w:val="04A0"/>
-      </w:tblPr>
-      <w:tblGrid>
-        <w:gridCol w:w="8640"/>
-      </w:tblGrid>
-      <w:tr>
-        <w:tc>
-          <w:tcPr>
-            <w:tcW w:type="dxa" w:w="8640"/>
-            <w:shd w:fill="F3F4F6"/>
-          </w:tcPr>
-          <w:p>
-            <w:pPr>
-              <w:jc w:val="center"/>
-            </w:pPr>
-            <w:r>
-              <w:rPr>
-                <w:i/>
-                <w:color w:val="777777"/>
-              </w:rPr>
-              <w:br/>
-              <w:t>[ SCREENSHOT PLACEHOLDER: User calling Admin viewalluser API (RBAC Verification) ]</w:t>
-              <w:br/>
-              <w:t>(Paste screenshot here or save image as screenshots/task8_2_user_call_admin_api.png)</w:t>
-              <w:br/>
-            </w:r>
-          </w:p>
-        </w:tc>
-      </w:tr>
-    </w:tbl>
+    <w:p>
+      <w:r>
+        <w:t>Figure: User calling Admin viewalluser API (RBAC Verification) Screenshot</w:t>
+      </w:r>
+    </w:p>
+    <w:p>
+      <w:r>
+        <w:drawing>
+          <wp:inline xmlns:a="http://schemas.openxmlformats.org/drawingml/2006/main" xmlns:pic="http://schemas.openxmlformats.org/drawingml/2006/picture">
+            <wp:extent cx="5669280" cy="3543300"/>
+            <wp:docPr id="12" name="Picture 12"/>
+            <wp:cNvGraphicFramePr>
+              <a:graphicFrameLocks noChangeAspect="1"/>
+            </wp:cNvGraphicFramePr>
+            <a:graphic>
+              <a:graphicData uri="http://schemas.openxmlformats.org/drawingml/2006/picture">
+                <pic:pic>
+                  <pic:nvPicPr>
+                    <pic:cNvPr id="0" name="task8_2_user_call_admin_api.png"/>
+                    <pic:cNvPicPr/>
+                  </pic:nvPicPr>
+                  <pic:blipFill>
+                    <a:blip r:embed="rId20"/>
+                    <a:stretch>
+                      <a:fillRect/>
+                    </a:stretch>
+                  </pic:blipFill>
+                  <pic:spPr>
+                    <a:xfrm>
+                      <a:off x="0" y="0"/>
+                      <a:ext cx="5669280" cy="3543300"/>
+                    </a:xfrm>
+                    <a:prstGeom prst="rect"/>
+                  </pic:spPr>
+                </pic:pic>
+              </a:graphicData>
+            </a:graphic>
+          </wp:inline>
+        </w:drawing>
+      </w:r>
+    </w:p>
     <w:p>
       <w:pPr>
         <w:spacing w:after="160"/>

</xml_diff>